<commit_message>
Illustre 4 fiches avec des schemas originaux : reseau 207, deux reseaux IP, anatomie mBot, codes architecte
Les fiches deviennent autonomes pour les eleves absents (le schema
projete figure desormais sur la fiche). Dessins originaux N&B.

Co-Authored-By: Claude Fable 5 <noreply@anthropic.com>
</commit_message>
<xml_diff>
--- a/public/2026/seq03/FICHE_S3-A01_DeuxReseaux_4eme.docx
+++ b/public/2026/seq03/FICHE_S3-A01_DeuxReseaux_4eme.docx
@@ -279,7 +279,7 @@
     </w:tbl>
     <w:p>
       <w:pPr>
-        <w:spacing w:after="96"/>
+        <w:spacing w:after="81"/>
       </w:pPr>
     </w:p>
     <w:tbl>
@@ -493,7 +493,7 @@
     </w:tbl>
     <w:p>
       <w:pPr>
-        <w:spacing w:after="128"/>
+        <w:spacing w:after="108"/>
       </w:pPr>
     </w:p>
     <w:tbl>
@@ -553,7 +553,7 @@
     </w:tbl>
     <w:p>
       <w:pPr>
-        <w:spacing w:after="128"/>
+        <w:spacing w:after="108"/>
       </w:pPr>
     </w:p>
     <w:tbl>
@@ -591,7 +591,7 @@
           </w:tcPr>
           <w:p>
             <w:pPr>
-              <w:spacing w:after="48"/>
+              <w:spacing w:after="41"/>
             </w:pPr>
             <w:r>
               <w:rPr>
@@ -603,7 +603,7 @@
                 <w:sz w:val="26"/>
                 <w:szCs w:val="26"/>
               </w:rPr>
-              <w:t xml:space="preserve">Depuis la salle des professeurs (réseau administratif), impossible d'ouvrir les dossiers de la salle 207 (réseau pédagogique). Pourtant, tout est « au collège » ! Le schéma projeté montre les deux réseaux… et une bizarrerie : des ordinateurs ont la MÊME adresse IP.</w:t>
+              <w:t xml:space="preserve">Depuis la salle des professeurs (réseau administratif), impossible d'ouvrir les dossiers de la salle 207 (réseau pédagogique). Pourtant, tout est « au collège » ! Le schéma ci-dessous montre les deux réseaux… et une bizarrerie : des ordinateurs ont la MÊME adresse IP.</w:t>
             </w:r>
           </w:p>
           <w:p>
@@ -628,7 +628,7 @@
     </w:tbl>
     <w:p>
       <w:pPr>
-        <w:spacing w:after="128"/>
+        <w:spacing w:after="108"/>
       </w:pPr>
     </w:p>
     <w:tbl>
@@ -679,7 +679,7 @@
                 <w:sz w:val="28"/>
                 <w:szCs w:val="28"/>
               </w:rPr>
-              <w:t xml:space="preserve">PARTIE 1 — Anatomie du réseau  (schéma projeté au tableau)</w:t>
+              <w:t xml:space="preserve">PARTIE 1 — Anatomie du réseau  (schéma ci-dessous)</w:t>
             </w:r>
           </w:p>
         </w:tc>
@@ -687,12 +687,12 @@
     </w:tbl>
     <w:p>
       <w:pPr>
-        <w:spacing w:after="64"/>
+        <w:spacing w:after="54"/>
       </w:pPr>
     </w:p>
     <w:p>
       <w:pPr>
-        <w:spacing w:after="96"/>
+        <w:spacing w:after="81"/>
       </w:pPr>
       <w:r>
         <w:rPr>
@@ -721,7 +721,46 @@
     </w:p>
     <w:p>
       <w:pPr>
-        <w:spacing w:after="96"/>
+        <w:spacing w:before="60" w:after="80"/>
+        <w:jc w:val="center"/>
+      </w:pPr>
+      <w:r>
+        <w:drawing xmlns:wp="http://schemas.openxmlformats.org/drawingml/2006/wordprocessingDrawing">
+          <wp:inline distT="0" distB="0" distL="0" distR="0">
+            <wp:extent cx="5472000" cy="2934000"/>
+            <wp:docPr id="9725" name="schema_schema_deux_reseaux.png"/>
+            <a:graphic xmlns:a="http://schemas.openxmlformats.org/drawingml/2006/main">
+              <a:graphicData uri="http://schemas.openxmlformats.org/drawingml/2006/picture">
+                <pic:pic xmlns:pic="http://schemas.openxmlformats.org/drawingml/2006/picture">
+                  <pic:nvPicPr>
+                    <pic:cNvPr id="9725" name="schema_schema_deux_reseaux.png"/>
+                    <pic:cNvPicPr/>
+                  </pic:nvPicPr>
+                  <pic:blipFill>
+                    <a:blip xmlns:r="http://schemas.openxmlformats.org/officeDocument/2006/relationships" r:embed="rId902"/>
+                    <a:stretch>
+                      <a:fillRect/>
+                    </a:stretch>
+                  </pic:blipFill>
+                  <pic:spPr>
+                    <a:xfrm>
+                      <a:off x="0" y="0"/>
+                      <a:ext cx="5472000" cy="2934000"/>
+                    </a:xfrm>
+                    <a:prstGeom prst="rect">
+                      <a:avLst/>
+                    </a:prstGeom>
+                  </pic:spPr>
+                </pic:pic>
+              </a:graphicData>
+            </a:graphic>
+          </wp:inline>
+        </w:drawing>
+      </w:r>
+    </w:p>
+    <w:p>
+      <w:pPr>
+        <w:spacing w:after="81"/>
       </w:pPr>
       <w:r>
         <w:rPr>
@@ -1189,7 +1228,7 @@
     </w:tbl>
     <w:p>
       <w:pPr>
-        <w:spacing w:after="64" w:before="50"/>
+        <w:spacing w:after="54" w:before="50"/>
       </w:pPr>
       <w:r>
         <w:rPr>
@@ -1239,7 +1278,7 @@
           </w:tcPr>
           <w:p>
             <w:pPr>
-              <w:spacing w:after="64"/>
+              <w:spacing w:after="54"/>
             </w:pPr>
             <w:r>
               <w:rPr>
@@ -1256,7 +1295,7 @@
           </w:p>
           <w:p>
             <w:pPr>
-              <w:spacing w:after="80"/>
+              <w:spacing w:after="68"/>
             </w:pPr>
             <w:r>
               <w:rPr>
@@ -1273,7 +1312,7 @@
           </w:p>
           <w:p>
             <w:pPr>
-              <w:spacing w:after="80"/>
+              <w:spacing w:after="68"/>
             </w:pPr>
             <w:r>
               <w:rPr>
@@ -1290,7 +1329,7 @@
           </w:p>
           <w:p>
             <w:pPr>
-              <w:spacing w:after="80"/>
+              <w:spacing w:after="68"/>
             </w:pPr>
             <w:r>
               <w:rPr>
@@ -1310,7 +1349,7 @@
     </w:tbl>
     <w:p>
       <w:pPr>
-        <w:spacing w:after="80"/>
+        <w:spacing w:after="68"/>
       </w:pPr>
     </w:p>
     <w:tbl>
@@ -1369,12 +1408,12 @@
     </w:tbl>
     <w:p>
       <w:pPr>
-        <w:spacing w:after="64"/>
+        <w:spacing w:after="54"/>
       </w:pPr>
     </w:p>
     <w:p>
       <w:pPr>
-        <w:spacing w:after="48"/>
+        <w:spacing w:after="41"/>
       </w:pPr>
       <w:r>
         <w:rPr>
@@ -1391,7 +1430,7 @@
     </w:p>
     <w:p>
       <w:pPr>
-        <w:spacing w:after="96"/>
+        <w:spacing w:after="81"/>
       </w:pPr>
       <w:r>
         <w:rPr>
@@ -1408,7 +1447,7 @@
     </w:p>
     <w:p>
       <w:pPr>
-        <w:spacing w:after="80"/>
+        <w:spacing w:after="68"/>
       </w:pPr>
       <w:r>
         <w:rPr>
@@ -1425,7 +1464,7 @@
     </w:p>
     <w:p>
       <w:pPr>
-        <w:spacing w:after="48"/>
+        <w:spacing w:after="41"/>
       </w:pPr>
       <w:r>
         <w:rPr>
@@ -1442,7 +1481,7 @@
     </w:p>
     <w:p>
       <w:pPr>
-        <w:spacing w:after="96"/>
+        <w:spacing w:after="81"/>
       </w:pPr>
       <w:r>
         <w:rPr>
@@ -1459,7 +1498,7 @@
     </w:p>
     <w:p>
       <w:pPr>
-        <w:spacing w:after="96"/>
+        <w:spacing w:after="81"/>
       </w:pPr>
       <w:r>
         <w:rPr>
@@ -1476,7 +1515,7 @@
     </w:p>
     <w:p>
       <w:pPr>
-        <w:spacing w:after="64"/>
+        <w:spacing w:after="54"/>
       </w:pPr>
       <w:r>
         <w:rPr>
@@ -1547,12 +1586,12 @@
     </w:tbl>
     <w:p>
       <w:pPr>
-        <w:spacing w:after="64"/>
+        <w:spacing w:after="54"/>
       </w:pPr>
     </w:p>
     <w:p>
       <w:pPr>
-        <w:spacing w:after="96"/>
+        <w:spacing w:after="81"/>
       </w:pPr>
       <w:r>
         <w:rPr>
@@ -1888,7 +1927,7 @@
     </w:tbl>
     <w:p>
       <w:pPr>
-        <w:spacing w:after="80"/>
+        <w:spacing w:after="68"/>
       </w:pPr>
     </w:p>
     <w:tbl>
@@ -1927,7 +1966,7 @@
           </w:tcPr>
           <w:p>
             <w:pPr>
-              <w:spacing w:after="96"/>
+              <w:spacing w:after="81"/>
             </w:pPr>
             <w:r>
               <w:rPr>
@@ -1944,7 +1983,7 @@
           </w:p>
           <w:p>
             <w:pPr>
-              <w:spacing w:after="96"/>
+              <w:spacing w:after="81"/>
             </w:pPr>
             <w:r>
               <w:rPr>
@@ -1961,7 +2000,7 @@
           </w:p>
           <w:p>
             <w:pPr>
-              <w:spacing w:after="96"/>
+              <w:spacing w:after="81"/>
             </w:pPr>
             <w:r>
               <w:rPr>

</xml_diff>